<commit_message>
updated irb responses per Robert's suggestions
</commit_message>
<xml_diff>
--- a/irb/IRB questions draft/pt_in_nj_irb_notes.docx
+++ b/irb/IRB questions draft/pt_in_nj_irb_notes.docx
@@ -867,8 +867,24 @@
         </w:rPr>
         <w:t xml:space="preserve">Research participants will take part in several activities. First, participants will be asked to read a series of sentences in Portuguese in their natural speaking voice; these productions will be audio-recorded. Next, </w:t>
       </w:r>
-      <w:commentRangeStart w:id="0"/>
-      <w:commentRangeStart w:id="1"/>
+      <w:r>
+        <w:rPr>
+          <w:rFonts w:ascii="Palatino Linotype" w:hAnsi="Palatino Linotype" w:cs="Times New Roman"/>
+          <w:kern w:val="0"/>
+          <w:sz w:val="20"/>
+          <w:szCs w:val="20"/>
+        </w:rPr>
+        <w:t>Participants will be asked to tell a story in their own words based on images depicting a short narrative.</w:t>
+      </w:r>
+      <w:r>
+        <w:rPr>
+          <w:rFonts w:ascii="Helvetica" w:hAnsi="Helvetica" w:cs="Helvetica"/>
+          <w:kern w:val="0"/>
+          <w:sz w:val="20"/>
+          <w:szCs w:val="20"/>
+        </w:rPr>
+        <w:t xml:space="preserve"> </w:t>
+      </w:r>
       <w:r>
         <w:rPr>
           <w:rFonts w:ascii="Palatino Linotype" w:hAnsi="Palatino Linotype"/>
@@ -876,48 +892,26 @@
           <w:sz w:val="20"/>
           <w:szCs w:val="20"/>
         </w:rPr>
-        <w:t>participants will view images and a video depicting a short narrative and will then be asked to retell the narrative to the researcher in their own words</w:t>
-      </w:r>
-      <w:commentRangeEnd w:id="0"/>
-      <w:r>
-        <w:rPr>
-          <w:rStyle w:val="CommentReference"/>
+        <w:t>Participants will then complete</w:t>
+      </w:r>
+      <w:r>
+        <w:rPr>
           <w:rFonts w:ascii="Palatino Linotype" w:hAnsi="Palatino Linotype"/>
           <w:color w:val="000000" w:themeColor="text1"/>
           <w:sz w:val="20"/>
           <w:szCs w:val="20"/>
         </w:rPr>
-        <w:commentReference w:id="0"/>
-      </w:r>
-      <w:commentRangeEnd w:id="1"/>
-      <w:r>
-        <w:rPr>
-          <w:rStyle w:val="CommentReference"/>
+        <w:t xml:space="preserve"> the Bilingual Language Profile, a questionnaire about their language </w:t>
+      </w:r>
+      <w:r>
+        <w:rPr>
           <w:rFonts w:ascii="Palatino Linotype" w:hAnsi="Palatino Linotype"/>
           <w:color w:val="000000" w:themeColor="text1"/>
           <w:sz w:val="20"/>
           <w:szCs w:val="20"/>
         </w:rPr>
-        <w:commentReference w:id="1"/>
-      </w:r>
-      <w:r>
-        <w:rPr>
-          <w:rFonts w:ascii="Palatino Linotype" w:hAnsi="Palatino Linotype"/>
-          <w:color w:val="000000" w:themeColor="text1"/>
-          <w:sz w:val="20"/>
-          <w:szCs w:val="20"/>
-        </w:rPr>
-        <w:t xml:space="preserve">. Participants will then complete the Bilingual Language </w:t>
-      </w:r>
-      <w:r>
-        <w:rPr>
-          <w:rFonts w:ascii="Palatino Linotype" w:hAnsi="Palatino Linotype"/>
-          <w:color w:val="000000" w:themeColor="text1"/>
-          <w:sz w:val="20"/>
-          <w:szCs w:val="20"/>
-        </w:rPr>
         <w:lastRenderedPageBreak/>
-        <w:t>Profile, a questionnaire about their language experiences and patterns of language use. Finally, participants will answer a series of demographic questions.</w:t>
+        <w:t>experiences and patterns of language use. Finally, participants will answer a series of demographic questions.</w:t>
       </w:r>
     </w:p>
     <w:p>
@@ -1960,190 +1954,232 @@
         </w:rPr>
         <w:t xml:space="preserve">The study instruments include a Portuguese sentence-reading task, a narrative-retelling task, the Bilingual Language Profile questionnaire, and a demographic questionnaire. In the sentence-reading task, participants will read a series of sentences in Portuguese in their natural speaking voice while being audio-recorded. </w:t>
       </w:r>
+      <w:commentRangeStart w:id="0"/>
+      <w:r>
+        <w:rPr>
+          <w:rFonts w:ascii="Palatino Linotype" w:hAnsi="Palatino Linotype"/>
+          <w:color w:val="000000" w:themeColor="text1"/>
+          <w:sz w:val="20"/>
+          <w:szCs w:val="20"/>
+        </w:rPr>
+        <w:t xml:space="preserve">In the narrative-retelling task, </w:t>
+      </w:r>
+      <w:commentRangeEnd w:id="0"/>
+      <w:r>
+        <w:rPr>
+          <w:rStyle w:val="CommentReference"/>
+          <w:rFonts w:ascii="Palatino Linotype" w:hAnsi="Palatino Linotype" w:cs="Times New Roman"/>
+          <w:kern w:val="0"/>
+          <w:sz w:val="20"/>
+          <w:szCs w:val="20"/>
+        </w:rPr>
+        <w:commentReference w:id="0"/>
+      </w:r>
+      <w:r>
+        <w:rPr>
+          <w:rFonts w:ascii="Palatino Linotype" w:hAnsi="Palatino Linotype" w:cs="Times New Roman"/>
+          <w:kern w:val="0"/>
+          <w:sz w:val="20"/>
+          <w:szCs w:val="20"/>
+        </w:rPr>
+        <w:t>p</w:t>
+      </w:r>
+      <w:r>
+        <w:rPr>
+          <w:rFonts w:ascii="Palatino Linotype" w:hAnsi="Palatino Linotype" w:cs="Times New Roman"/>
+          <w:kern w:val="0"/>
+          <w:sz w:val="20"/>
+          <w:szCs w:val="20"/>
+        </w:rPr>
+        <w:t>articipants will be asked to tell a story in their own words based on images depicting a short narrative.</w:t>
+      </w:r>
+      <w:r>
+        <w:rPr>
+          <w:rFonts w:ascii="Helvetica" w:hAnsi="Helvetica" w:cs="Helvetica"/>
+          <w:kern w:val="0"/>
+          <w:sz w:val="20"/>
+          <w:szCs w:val="20"/>
+        </w:rPr>
+        <w:t xml:space="preserve"> </w:t>
+      </w:r>
+      <w:r>
+        <w:rPr>
+          <w:rFonts w:ascii="Palatino Linotype" w:hAnsi="Palatino Linotype"/>
+          <w:color w:val="000000" w:themeColor="text1"/>
+          <w:sz w:val="20"/>
+          <w:szCs w:val="20"/>
+        </w:rPr>
+        <w:t>Participants will also complete the Bilingual Language Profile, which collects information about their language experiences and patterns of language use. Finally, participants will answer demographic questions about their background.</w:t>
+      </w:r>
+    </w:p>
+    <w:p>
+      <w:pPr>
+        <w:spacing w:before="100" w:beforeAutospacing="1" w:after="100" w:afterAutospacing="1" w:line="276" w:lineRule="auto"/>
+        <w:rPr>
+          <w:rFonts w:ascii="Palatino Linotype" w:hAnsi="Palatino Linotype" w:cs="Times New Roman"/>
+          <w:color w:val="000000" w:themeColor="text1"/>
+          <w:sz w:val="20"/>
+          <w:szCs w:val="20"/>
+          <w:shd w:val="clear" w:color="auto" w:fill="FFFFFF"/>
+        </w:rPr>
+      </w:pPr>
+    </w:p>
+    <w:p>
+      <w:pPr>
+        <w:spacing w:before="100" w:beforeAutospacing="1" w:after="100" w:afterAutospacing="1" w:line="276" w:lineRule="auto"/>
+        <w:rPr>
+          <w:rFonts w:ascii="Palatino Linotype" w:hAnsi="Palatino Linotype" w:cs="Times New Roman"/>
+          <w:color w:val="000000" w:themeColor="text1"/>
+          <w:sz w:val="20"/>
+          <w:szCs w:val="20"/>
+          <w:shd w:val="clear" w:color="auto" w:fill="FFFFFF"/>
+        </w:rPr>
+      </w:pPr>
+      <w:r>
+        <w:rPr>
+          <w:rFonts w:ascii="Palatino Linotype" w:hAnsi="Palatino Linotype" w:cs="Times New Roman"/>
+          <w:b/>
+          <w:bCs/>
+          <w:color w:val="000000" w:themeColor="text1"/>
+          <w:sz w:val="20"/>
+          <w:szCs w:val="20"/>
+          <w:shd w:val="clear" w:color="auto" w:fill="FFFFFF"/>
+        </w:rPr>
+        <w:t xml:space="preserve">8.0. </w:t>
+      </w:r>
+      <w:r>
+        <w:rPr>
+          <w:rFonts w:ascii="Palatino Linotype" w:hAnsi="Palatino Linotype" w:cs="Times New Roman"/>
+          <w:b/>
+          <w:bCs/>
+          <w:color w:val="000000" w:themeColor="text1"/>
+          <w:sz w:val="20"/>
+          <w:szCs w:val="20"/>
+          <w:shd w:val="clear" w:color="auto" w:fill="FFFFFF"/>
+        </w:rPr>
+        <w:t>Method to Identify Potential Subjects: </w:t>
+      </w:r>
+      <w:r>
+        <w:rPr>
+          <w:rFonts w:ascii="Palatino Linotype" w:hAnsi="Palatino Linotype" w:cs="Times New Roman"/>
+          <w:color w:val="000000" w:themeColor="text1"/>
+          <w:sz w:val="20"/>
+          <w:szCs w:val="20"/>
+          <w:shd w:val="clear" w:color="auto" w:fill="FFFFFF"/>
+        </w:rPr>
+        <w:t>Describe the methods that will be used to identify potential subjects.</w:t>
+      </w:r>
+    </w:p>
+    <w:p>
+      <w:pPr>
+        <w:spacing w:before="100" w:beforeAutospacing="1" w:after="100" w:afterAutospacing="1" w:line="276" w:lineRule="auto"/>
+        <w:rPr>
+          <w:rFonts w:ascii="Palatino Linotype" w:hAnsi="Palatino Linotype" w:cs="Arial"/>
+          <w:color w:val="000000" w:themeColor="text1"/>
+          <w:sz w:val="20"/>
+          <w:szCs w:val="20"/>
+          <w:shd w:val="clear" w:color="auto" w:fill="FFFFFF"/>
+        </w:rPr>
+      </w:pPr>
+      <w:r>
+        <w:rPr>
+          <w:rFonts w:ascii="Palatino Linotype" w:hAnsi="Palatino Linotype"/>
+          <w:color w:val="000000" w:themeColor="text1"/>
+          <w:sz w:val="20"/>
+          <w:szCs w:val="20"/>
+        </w:rPr>
+        <w:t>All speakers of Portuguese who are over the age of 18, have the capacity to consent, live in New Jersey or have substantial ties to a Portuguese-speaking community in New Jersey, and can participate in the study procedures are eligible to participate. I</w:t>
+      </w:r>
+      <w:r>
+        <w:rPr>
+          <w:rFonts w:ascii="Palatino Linotype" w:hAnsi="Palatino Linotype" w:cs="Arial"/>
+          <w:color w:val="000000" w:themeColor="text1"/>
+          <w:sz w:val="20"/>
+          <w:szCs w:val="20"/>
+          <w:shd w:val="clear" w:color="auto" w:fill="FFFFFF"/>
+        </w:rPr>
+        <w:t>nterested persons will self-identify as potential subjects by reaching out the researchers using the contact information on the recruitment materials and which time they researchers will confirm that they meet the criteria for the study.</w:t>
+      </w:r>
+    </w:p>
+    <w:p>
+      <w:pPr>
+        <w:spacing w:before="100" w:beforeAutospacing="1" w:after="100" w:afterAutospacing="1" w:line="276" w:lineRule="auto"/>
+        <w:rPr>
+          <w:rFonts w:ascii="Palatino Linotype" w:hAnsi="Palatino Linotype" w:cs="Times New Roman"/>
+          <w:color w:val="000000" w:themeColor="text1"/>
+          <w:sz w:val="20"/>
+          <w:szCs w:val="20"/>
+          <w:shd w:val="clear" w:color="auto" w:fill="FFFFFF"/>
+        </w:rPr>
+      </w:pPr>
+    </w:p>
+    <w:p>
+      <w:pPr>
+        <w:spacing w:before="100" w:beforeAutospacing="1" w:after="100" w:afterAutospacing="1" w:line="276" w:lineRule="auto"/>
+        <w:rPr>
+          <w:rFonts w:ascii="Palatino Linotype" w:hAnsi="Palatino Linotype" w:cs="Times New Roman"/>
+          <w:color w:val="000000" w:themeColor="text1"/>
+          <w:sz w:val="20"/>
+          <w:szCs w:val="20"/>
+          <w:shd w:val="clear" w:color="auto" w:fill="FFFFFF"/>
+        </w:rPr>
+      </w:pPr>
+      <w:r>
+        <w:rPr>
+          <w:rFonts w:ascii="Palatino Linotype" w:hAnsi="Palatino Linotype" w:cs="Times New Roman"/>
+          <w:b/>
+          <w:bCs/>
+          <w:color w:val="000000" w:themeColor="text1"/>
+          <w:sz w:val="20"/>
+          <w:szCs w:val="20"/>
+          <w:shd w:val="clear" w:color="auto" w:fill="FFFFFF"/>
+        </w:rPr>
+        <w:t xml:space="preserve">9.0. </w:t>
+      </w:r>
+      <w:commentRangeStart w:id="1"/>
       <w:commentRangeStart w:id="2"/>
       <w:r>
         <w:rPr>
-          <w:rFonts w:ascii="Palatino Linotype" w:hAnsi="Palatino Linotype"/>
-          <w:color w:val="000000" w:themeColor="text1"/>
-          <w:sz w:val="20"/>
-          <w:szCs w:val="20"/>
-        </w:rPr>
-        <w:t>In the narrative-retelling task, participants will view images and a short video and then retell the narrative to the researcher in their own words</w:t>
+          <w:rFonts w:ascii="Palatino Linotype" w:hAnsi="Palatino Linotype" w:cs="Times New Roman"/>
+          <w:b/>
+          <w:bCs/>
+          <w:color w:val="000000" w:themeColor="text1"/>
+          <w:sz w:val="20"/>
+          <w:szCs w:val="20"/>
+          <w:shd w:val="clear" w:color="auto" w:fill="FFFFFF"/>
+        </w:rPr>
+        <w:t>Recruitment Details</w:t>
+      </w:r>
+      <w:commentRangeEnd w:id="1"/>
+      <w:r>
+        <w:rPr>
+          <w:rStyle w:val="CommentReference"/>
+          <w:rFonts w:ascii="Palatino Linotype" w:hAnsi="Palatino Linotype" w:cs="Times New Roman"/>
+          <w:b/>
+          <w:bCs/>
+          <w:color w:val="000000" w:themeColor="text1"/>
+          <w:sz w:val="20"/>
+          <w:szCs w:val="20"/>
+          <w:shd w:val="clear" w:color="auto" w:fill="FFFFFF"/>
+        </w:rPr>
+        <w:commentReference w:id="1"/>
       </w:r>
       <w:commentRangeEnd w:id="2"/>
       <w:r>
         <w:rPr>
           <w:rStyle w:val="CommentReference"/>
-          <w:rFonts w:ascii="Palatino Linotype" w:hAnsi="Palatino Linotype"/>
-          <w:color w:val="000000" w:themeColor="text1"/>
-          <w:sz w:val="20"/>
-          <w:szCs w:val="20"/>
+          <w:rFonts w:ascii="Palatino Linotype" w:hAnsi="Palatino Linotype" w:cs="Times New Roman"/>
+          <w:b/>
+          <w:bCs/>
+          <w:color w:val="000000" w:themeColor="text1"/>
+          <w:sz w:val="20"/>
+          <w:szCs w:val="20"/>
+          <w:shd w:val="clear" w:color="auto" w:fill="FFFFFF"/>
         </w:rPr>
         <w:commentReference w:id="2"/>
       </w:r>
       <w:r>
         <w:rPr>
-          <w:rFonts w:ascii="Palatino Linotype" w:hAnsi="Palatino Linotype"/>
-          <w:color w:val="000000" w:themeColor="text1"/>
-          <w:sz w:val="20"/>
-          <w:szCs w:val="20"/>
-        </w:rPr>
-        <w:t>. Participants will also complete the Bilingual Language Profile, which collects information about their language experiences and patterns of language use. Finally, participants will answer demographic questions about their background.</w:t>
-      </w:r>
-    </w:p>
-    <w:p>
-      <w:pPr>
-        <w:spacing w:before="100" w:beforeAutospacing="1" w:after="100" w:afterAutospacing="1" w:line="276" w:lineRule="auto"/>
-        <w:rPr>
-          <w:rFonts w:ascii="Palatino Linotype" w:hAnsi="Palatino Linotype" w:cs="Times New Roman"/>
-          <w:color w:val="000000" w:themeColor="text1"/>
-          <w:sz w:val="20"/>
-          <w:szCs w:val="20"/>
-          <w:shd w:val="clear" w:color="auto" w:fill="FFFFFF"/>
-        </w:rPr>
-      </w:pPr>
-    </w:p>
-    <w:p>
-      <w:pPr>
-        <w:spacing w:before="100" w:beforeAutospacing="1" w:after="100" w:afterAutospacing="1" w:line="276" w:lineRule="auto"/>
-        <w:rPr>
-          <w:rFonts w:ascii="Palatino Linotype" w:hAnsi="Palatino Linotype" w:cs="Times New Roman"/>
-          <w:color w:val="000000" w:themeColor="text1"/>
-          <w:sz w:val="20"/>
-          <w:szCs w:val="20"/>
-          <w:shd w:val="clear" w:color="auto" w:fill="FFFFFF"/>
-        </w:rPr>
-      </w:pPr>
-      <w:r>
-        <w:rPr>
-          <w:rFonts w:ascii="Palatino Linotype" w:hAnsi="Palatino Linotype" w:cs="Times New Roman"/>
-          <w:b/>
-          <w:bCs/>
-          <w:color w:val="000000" w:themeColor="text1"/>
-          <w:sz w:val="20"/>
-          <w:szCs w:val="20"/>
-          <w:shd w:val="clear" w:color="auto" w:fill="FFFFFF"/>
-        </w:rPr>
-        <w:t xml:space="preserve">8.0. </w:t>
-      </w:r>
-      <w:r>
-        <w:rPr>
-          <w:rFonts w:ascii="Palatino Linotype" w:hAnsi="Palatino Linotype" w:cs="Times New Roman"/>
-          <w:b/>
-          <w:bCs/>
-          <w:color w:val="000000" w:themeColor="text1"/>
-          <w:sz w:val="20"/>
-          <w:szCs w:val="20"/>
-          <w:shd w:val="clear" w:color="auto" w:fill="FFFFFF"/>
-        </w:rPr>
-        <w:t>Method to Identify Potential Subjects: </w:t>
-      </w:r>
-      <w:r>
-        <w:rPr>
-          <w:rFonts w:ascii="Palatino Linotype" w:hAnsi="Palatino Linotype" w:cs="Times New Roman"/>
-          <w:color w:val="000000" w:themeColor="text1"/>
-          <w:sz w:val="20"/>
-          <w:szCs w:val="20"/>
-          <w:shd w:val="clear" w:color="auto" w:fill="FFFFFF"/>
-        </w:rPr>
-        <w:t>Describe the methods that will be used to identify potential subjects.</w:t>
-      </w:r>
-    </w:p>
-    <w:p>
-      <w:pPr>
-        <w:spacing w:before="100" w:beforeAutospacing="1" w:after="100" w:afterAutospacing="1" w:line="276" w:lineRule="auto"/>
-        <w:rPr>
-          <w:rFonts w:ascii="Palatino Linotype" w:hAnsi="Palatino Linotype" w:cs="Arial"/>
-          <w:color w:val="000000" w:themeColor="text1"/>
-          <w:sz w:val="20"/>
-          <w:szCs w:val="20"/>
-          <w:shd w:val="clear" w:color="auto" w:fill="FFFFFF"/>
-        </w:rPr>
-      </w:pPr>
-      <w:r>
-        <w:rPr>
-          <w:rFonts w:ascii="Palatino Linotype" w:hAnsi="Palatino Linotype"/>
-          <w:color w:val="000000" w:themeColor="text1"/>
-          <w:sz w:val="20"/>
-          <w:szCs w:val="20"/>
-        </w:rPr>
-        <w:t>All speakers of Portuguese who are over the age of 18, have the capacity to consent, live in New Jersey or have substantial ties to a Portuguese-speaking community in New Jersey, and can participate in the study procedures are eligible to participate. I</w:t>
-      </w:r>
-      <w:r>
-        <w:rPr>
-          <w:rFonts w:ascii="Palatino Linotype" w:hAnsi="Palatino Linotype" w:cs="Arial"/>
-          <w:color w:val="000000" w:themeColor="text1"/>
-          <w:sz w:val="20"/>
-          <w:szCs w:val="20"/>
-          <w:shd w:val="clear" w:color="auto" w:fill="FFFFFF"/>
-        </w:rPr>
-        <w:t>nterested persons will self-identify as potential subjects by reaching out the researchers using the contact information on the recruitment materials and which time they researchers will confirm that they meet the criteria for the study.</w:t>
-      </w:r>
-    </w:p>
-    <w:p>
-      <w:pPr>
-        <w:spacing w:before="100" w:beforeAutospacing="1" w:after="100" w:afterAutospacing="1" w:line="276" w:lineRule="auto"/>
-        <w:rPr>
-          <w:rFonts w:ascii="Palatino Linotype" w:hAnsi="Palatino Linotype" w:cs="Times New Roman"/>
-          <w:color w:val="000000" w:themeColor="text1"/>
-          <w:sz w:val="20"/>
-          <w:szCs w:val="20"/>
-          <w:shd w:val="clear" w:color="auto" w:fill="FFFFFF"/>
-        </w:rPr>
-      </w:pPr>
-    </w:p>
-    <w:p>
-      <w:pPr>
-        <w:spacing w:before="100" w:beforeAutospacing="1" w:after="100" w:afterAutospacing="1" w:line="276" w:lineRule="auto"/>
-        <w:rPr>
-          <w:rFonts w:ascii="Palatino Linotype" w:hAnsi="Palatino Linotype" w:cs="Times New Roman"/>
-          <w:color w:val="000000" w:themeColor="text1"/>
-          <w:sz w:val="20"/>
-          <w:szCs w:val="20"/>
-          <w:shd w:val="clear" w:color="auto" w:fill="FFFFFF"/>
-        </w:rPr>
-      </w:pPr>
-      <w:r>
-        <w:rPr>
-          <w:rFonts w:ascii="Palatino Linotype" w:hAnsi="Palatino Linotype" w:cs="Times New Roman"/>
-          <w:b/>
-          <w:bCs/>
-          <w:color w:val="000000" w:themeColor="text1"/>
-          <w:sz w:val="20"/>
-          <w:szCs w:val="20"/>
-          <w:shd w:val="clear" w:color="auto" w:fill="FFFFFF"/>
-        </w:rPr>
-        <w:t xml:space="preserve">9.0. </w:t>
-      </w:r>
-      <w:commentRangeStart w:id="3"/>
-      <w:r>
-        <w:rPr>
-          <w:rFonts w:ascii="Palatino Linotype" w:hAnsi="Palatino Linotype" w:cs="Times New Roman"/>
-          <w:b/>
-          <w:bCs/>
-          <w:color w:val="000000" w:themeColor="text1"/>
-          <w:sz w:val="20"/>
-          <w:szCs w:val="20"/>
-          <w:shd w:val="clear" w:color="auto" w:fill="FFFFFF"/>
-        </w:rPr>
-        <w:t>Recruitment Details</w:t>
-      </w:r>
-      <w:commentRangeEnd w:id="3"/>
-      <w:r>
-        <w:rPr>
-          <w:rStyle w:val="CommentReference"/>
-          <w:rFonts w:ascii="Palatino Linotype" w:hAnsi="Palatino Linotype" w:cs="Times New Roman"/>
-          <w:b/>
-          <w:bCs/>
-          <w:color w:val="000000" w:themeColor="text1"/>
-          <w:sz w:val="20"/>
-          <w:szCs w:val="20"/>
-          <w:shd w:val="clear" w:color="auto" w:fill="FFFFFF"/>
-        </w:rPr>
-        <w:commentReference w:id="3"/>
-      </w:r>
-      <w:r>
-        <w:rPr>
           <w:rFonts w:ascii="Palatino Linotype" w:hAnsi="Palatino Linotype" w:cs="Times New Roman"/>
           <w:b/>
           <w:bCs/>
@@ -2185,6 +2221,16 @@
           <w:shd w:val="clear" w:color="auto" w:fill="FFFFFF"/>
         </w:rPr>
         <w:t>Potential subjects will be recruited using flyers, internet postings, and business cards. Flyers will be posted in the local community, including in community centers and commercial areas. Information about the study will be posted on online fora, such as Facebook, in groups/pages related to Newark and New Jersey. Additionally, should the investigators encounter groups of adult Portuguese speakers in the community (e.g., at local community engagement events), they will be offered business cards with the researchers’ contact information should they be interested in participating. All these recruitment activities will be undertaken by the listed study personnel.</w:t>
+      </w:r>
+      <w:r>
+        <w:rPr>
+          <w:rFonts w:ascii="Palatino Linotype" w:hAnsi="Palatino Linotype" w:cs="Arial"/>
+          <w:color w:val="000000" w:themeColor="text1"/>
+          <w:sz w:val="20"/>
+          <w:szCs w:val="20"/>
+          <w:shd w:val="clear" w:color="auto" w:fill="FFFFFF"/>
+        </w:rPr>
+        <w:t xml:space="preserve"> Additionally, individuals who participate in the study will be offered copies of our flyers to share with interested friends and family, should they decide to do so.</w:t>
       </w:r>
     </w:p>
     <w:p>
@@ -2625,6 +2671,7 @@
         </w:rPr>
         <w:t xml:space="preserve">All participants who complete all study instruments will receive a physical gift card with a </w:t>
       </w:r>
+      <w:commentRangeStart w:id="3"/>
       <w:commentRangeStart w:id="4"/>
       <w:r>
         <w:rPr>
@@ -2635,7 +2682,17 @@
           <w:highlight w:val="yellow"/>
           <w:shd w:val="clear" w:color="auto" w:fill="FFFFFF"/>
         </w:rPr>
-        <w:t>$XX</w:t>
+        <w:t>$</w:t>
+      </w:r>
+      <w:r>
+        <w:rPr>
+          <w:rFonts w:ascii="Palatino Linotype" w:hAnsi="Palatino Linotype" w:cs="Arial"/>
+          <w:color w:val="000000" w:themeColor="text1"/>
+          <w:sz w:val="20"/>
+          <w:szCs w:val="20"/>
+          <w:shd w:val="clear" w:color="auto" w:fill="FFFFFF"/>
+        </w:rPr>
+        <w:t>20</w:t>
       </w:r>
       <w:r>
         <w:rPr>
@@ -2646,6 +2703,18 @@
           <w:shd w:val="clear" w:color="auto" w:fill="FFFFFF"/>
         </w:rPr>
         <w:t xml:space="preserve"> </w:t>
+      </w:r>
+      <w:commentRangeEnd w:id="3"/>
+      <w:r>
+        <w:rPr>
+          <w:rStyle w:val="CommentReference"/>
+          <w:rFonts w:ascii="Palatino Linotype" w:hAnsi="Palatino Linotype" w:cs="Arial"/>
+          <w:color w:val="000000" w:themeColor="text1"/>
+          <w:sz w:val="20"/>
+          <w:szCs w:val="20"/>
+          <w:shd w:val="clear" w:color="auto" w:fill="FFFFFF"/>
+        </w:rPr>
+        <w:commentReference w:id="3"/>
       </w:r>
       <w:commentRangeEnd w:id="4"/>
       <w:r>
@@ -5282,7 +5351,7 @@
 
 <file path=word/comments.xml><?xml version="1.0" encoding="utf-8"?>
 <w:comments xmlns:wpc="http://schemas.microsoft.com/office/word/2010/wordprocessingCanvas" xmlns:cx="http://schemas.microsoft.com/office/drawing/2014/chartex" xmlns:cx1="http://schemas.microsoft.com/office/drawing/2015/9/8/chartex" xmlns:cx2="http://schemas.microsoft.com/office/drawing/2015/10/21/chartex" xmlns:cx3="http://schemas.microsoft.com/office/drawing/2016/5/9/chartex" xmlns:cx4="http://schemas.microsoft.com/office/drawing/2016/5/10/chartex" xmlns:cx5="http://schemas.microsoft.com/office/drawing/2016/5/11/chartex" xmlns:cx6="http://schemas.microsoft.com/office/drawing/2016/5/12/chartex" xmlns:cx7="http://schemas.microsoft.com/office/drawing/2016/5/13/chartex" xmlns:cx8="http://schemas.microsoft.com/office/drawing/2016/5/14/chartex" xmlns:mc="http://schemas.openxmlformats.org/markup-compatibility/2006" xmlns:aink="http://schemas.microsoft.com/office/drawing/2016/ink" xmlns:am3d="http://schemas.microsoft.com/office/drawing/2017/model3d" xmlns:o="urn:schemas-microsoft-com:office:office" xmlns:oel="http://schemas.microsoft.com/office/2019/extlst" xmlns:r="http://schemas.openxmlformats.org/officeDocument/2006/relationships" xmlns:m="http://schemas.openxmlformats.org/officeDocument/2006/math" xmlns:v="urn:schemas-microsoft-com:vml" xmlns:wp14="http://schemas.microsoft.com/office/word/2010/wordprocessingDrawing" xmlns:wp="http://schemas.openxmlformats.org/drawingml/2006/wordprocessingDrawing" xmlns:w10="urn:schemas-microsoft-com:office:word" xmlns:w="http://schemas.openxmlformats.org/wordprocessingml/2006/main" xmlns:w14="http://schemas.microsoft.com/office/word/2010/wordml" xmlns:w15="http://schemas.microsoft.com/office/word/2012/wordml" xmlns:w16cex="http://schemas.microsoft.com/office/word/2018/wordml/cex" xmlns:w16cid="http://schemas.microsoft.com/office/word/2016/wordml/cid" xmlns:w16="http://schemas.microsoft.com/office/word/2018/wordml" xmlns:w16du="http://schemas.microsoft.com/office/word/2023/wordml/word16du" xmlns:w16sdtdh="http://schemas.microsoft.com/office/word/2020/wordml/sdtdatahash" xmlns:w16sdtfl="http://schemas.microsoft.com/office/word/2024/wordml/sdtformatlock" xmlns:w16se="http://schemas.microsoft.com/office/word/2015/wordml/symex" xmlns:wpg="http://schemas.microsoft.com/office/word/2010/wordprocessingGroup" xmlns:wpi="http://schemas.microsoft.com/office/word/2010/wordprocessingInk" xmlns:wne="http://schemas.microsoft.com/office/word/2006/wordml" xmlns:wps="http://schemas.microsoft.com/office/word/2010/wordprocessingShape" mc:Ignorable="w14 w15 w16se w16cid w16 w16cex w16sdtdh w16sdtfl w16du wp14">
-  <w:comment w:id="0" w:author="Robert Esposito" w:date="2026-06-19T13:33:00Z" w:initials="RE">
+  <w:comment w:id="0" w:author="Robert Esposito" w:date="2026-06-19T13:39:00Z" w:initials="RE">
     <w:p>
       <w:pPr>
         <w:pStyle w:val="CommentText"/>
@@ -5294,11 +5363,11 @@
         <w:annotationRef/>
       </w:r>
       <w:r>
-        <w:t>Participants will be asked to tell a story in their own words based on images depicting a short narrative.</w:t>
+        <w:t>Same as above: Participants will be asked to tell a story in their own words based on images depicting a short narrative.</w:t>
       </w:r>
     </w:p>
   </w:comment>
-  <w:comment w:id="1" w:author="Robert Esposito" w:date="2026-06-19T13:34:00Z" w:initials="RE">
+  <w:comment w:id="1" w:author="Robert Esposito" w:date="2026-06-19T13:42:00Z" w:initials="RE">
     <w:p>
       <w:pPr>
         <w:pStyle w:val="CommentText"/>
@@ -5310,11 +5379,28 @@
         <w:annotationRef/>
       </w:r>
       <w:r>
-        <w:t>^ maybe this instead? They won’t be viewing a video, and they’ll be telling the story AS the view the images, not after.</w:t>
+        <w:t>Do we need to identify that we’ll ask participants to share our contact info with their friends/family?</w:t>
       </w:r>
     </w:p>
   </w:comment>
-  <w:comment w:id="2" w:author="Robert Esposito" w:date="2026-06-19T13:39:00Z" w:initials="RE">
+  <w:comment w:id="2" w:author="Kendra Dickinson" w:date="2026-06-25T06:47:00Z" w:initials="KD">
+    <w:p>
+      <w:r>
+        <w:rPr>
+          <w:rStyle w:val="CommentReference"/>
+        </w:rPr>
+        <w:annotationRef/>
+      </w:r>
+      <w:r>
+        <w:rPr>
+          <w:sz w:val="20"/>
+          <w:szCs w:val="20"/>
+        </w:rPr>
+        <w:t>Good point! I added that.</w:t>
+      </w:r>
+    </w:p>
+  </w:comment>
+  <w:comment w:id="3" w:author="Robert Esposito" w:date="2026-06-19T13:45:00Z" w:initials="RE">
     <w:p>
       <w:pPr>
         <w:pStyle w:val="CommentText"/>
@@ -5326,15 +5412,12 @@
         <w:annotationRef/>
       </w:r>
       <w:r>
-        <w:t>Same as above: Participants will be asked to tell a story in their own words based on images depicting a short narrative.</w:t>
+        <w:t>I think $20-$30 would be good. Are we able to start at $20, see what we get, and bump it up to $25 or $30 if we don’t get good responses?</w:t>
       </w:r>
     </w:p>
   </w:comment>
-  <w:comment w:id="3" w:author="Robert Esposito" w:date="2026-06-19T13:42:00Z" w:initials="RE">
-    <w:p>
-      <w:pPr>
-        <w:pStyle w:val="CommentText"/>
-      </w:pPr>
+  <w:comment w:id="4" w:author="Kendra Dickinson" w:date="2026-06-25T06:48:00Z" w:initials="KD">
+    <w:p>
       <w:r>
         <w:rPr>
           <w:rStyle w:val="CommentReference"/>
@@ -5342,23 +5425,11 @@
         <w:annotationRef/>
       </w:r>
       <w:r>
-        <w:t>Do we need to identify that we’ll ask participants to share our contact info with their friends/family?</w:t>
-      </w:r>
-    </w:p>
-  </w:comment>
-  <w:comment w:id="4" w:author="Robert Esposito" w:date="2026-06-19T13:45:00Z" w:initials="RE">
-    <w:p>
-      <w:pPr>
-        <w:pStyle w:val="CommentText"/>
-      </w:pPr>
-      <w:r>
-        <w:rPr>
-          <w:rStyle w:val="CommentReference"/>
-        </w:rPr>
-        <w:annotationRef/>
-      </w:r>
-      <w:r>
-        <w:t>I think $20-$30 would be good. Are we able to start at $20, see what we get, and bump it up to $25 or $30 if we don’t get good responses?</w:t>
+        <w:rPr>
+          <w:sz w:val="20"/>
+          <w:szCs w:val="20"/>
+        </w:rPr>
+        <w:t>good idea!</w:t>
       </w:r>
     </w:p>
   </w:comment>
@@ -5367,31 +5438,31 @@
 
 <file path=word/commentsExtended.xml><?xml version="1.0" encoding="utf-8"?>
 <w15:commentsEx xmlns:wpc="http://schemas.microsoft.com/office/word/2010/wordprocessingCanvas" xmlns:cx="http://schemas.microsoft.com/office/drawing/2014/chartex" xmlns:cx1="http://schemas.microsoft.com/office/drawing/2015/9/8/chartex" xmlns:cx2="http://schemas.microsoft.com/office/drawing/2015/10/21/chartex" xmlns:cx3="http://schemas.microsoft.com/office/drawing/2016/5/9/chartex" xmlns:cx4="http://schemas.microsoft.com/office/drawing/2016/5/10/chartex" xmlns:cx5="http://schemas.microsoft.com/office/drawing/2016/5/11/chartex" xmlns:cx6="http://schemas.microsoft.com/office/drawing/2016/5/12/chartex" xmlns:cx7="http://schemas.microsoft.com/office/drawing/2016/5/13/chartex" xmlns:cx8="http://schemas.microsoft.com/office/drawing/2016/5/14/chartex" xmlns:mc="http://schemas.openxmlformats.org/markup-compatibility/2006" xmlns:aink="http://schemas.microsoft.com/office/drawing/2016/ink" xmlns:am3d="http://schemas.microsoft.com/office/drawing/2017/model3d" xmlns:o="urn:schemas-microsoft-com:office:office" xmlns:oel="http://schemas.microsoft.com/office/2019/extlst" xmlns:r="http://schemas.openxmlformats.org/officeDocument/2006/relationships" xmlns:m="http://schemas.openxmlformats.org/officeDocument/2006/math" xmlns:v="urn:schemas-microsoft-com:vml" xmlns:wp14="http://schemas.microsoft.com/office/word/2010/wordprocessingDrawing" xmlns:wp="http://schemas.openxmlformats.org/drawingml/2006/wordprocessingDrawing" xmlns:w10="urn:schemas-microsoft-com:office:word" xmlns:w="http://schemas.openxmlformats.org/wordprocessingml/2006/main" xmlns:w14="http://schemas.microsoft.com/office/word/2010/wordml" xmlns:w15="http://schemas.microsoft.com/office/word/2012/wordml" xmlns:w16cex="http://schemas.microsoft.com/office/word/2018/wordml/cex" xmlns:w16cid="http://schemas.microsoft.com/office/word/2016/wordml/cid" xmlns:w16="http://schemas.microsoft.com/office/word/2018/wordml" xmlns:w16du="http://schemas.microsoft.com/office/word/2023/wordml/word16du" xmlns:w16sdtdh="http://schemas.microsoft.com/office/word/2020/wordml/sdtdatahash" xmlns:w16sdtfl="http://schemas.microsoft.com/office/word/2024/wordml/sdtformatlock" xmlns:w16se="http://schemas.microsoft.com/office/word/2015/wordml/symex" xmlns:wpg="http://schemas.microsoft.com/office/word/2010/wordprocessingGroup" xmlns:wpi="http://schemas.microsoft.com/office/word/2010/wordprocessingInk" xmlns:wne="http://schemas.microsoft.com/office/word/2006/wordml" xmlns:wps="http://schemas.microsoft.com/office/word/2010/wordprocessingShape" mc:Ignorable="w14 w15 w16se w16cid w16 w16cex w16sdtdh w16sdtfl w16du wp14">
-  <w15:commentEx w15:paraId="1531EC56" w15:done="0"/>
-  <w15:commentEx w15:paraId="0FC473E1" w15:paraIdParent="1531EC56" w15:done="0"/>
-  <w15:commentEx w15:paraId="03418435" w15:done="0"/>
+  <w15:commentEx w15:paraId="03418435" w15:done="1"/>
   <w15:commentEx w15:paraId="4ACB135A" w15:done="0"/>
+  <w15:commentEx w15:paraId="1DC52F10" w15:paraIdParent="4ACB135A" w15:done="0"/>
   <w15:commentEx w15:paraId="57AAFF26" w15:done="0"/>
+  <w15:commentEx w15:paraId="72B35436" w15:paraIdParent="57AAFF26" w15:done="0"/>
 </w15:commentsEx>
 </file>
 
 <file path=word/commentsExtensible.xml><?xml version="1.0" encoding="utf-8"?>
 <w16cex:commentsExtensible xmlns:wpc="http://schemas.microsoft.com/office/word/2010/wordprocessingCanvas" xmlns:cx="http://schemas.microsoft.com/office/drawing/2014/chartex" xmlns:cx1="http://schemas.microsoft.com/office/drawing/2015/9/8/chartex" xmlns:cx2="http://schemas.microsoft.com/office/drawing/2015/10/21/chartex" xmlns:cx3="http://schemas.microsoft.com/office/drawing/2016/5/9/chartex" xmlns:cx4="http://schemas.microsoft.com/office/drawing/2016/5/10/chartex" xmlns:cx5="http://schemas.microsoft.com/office/drawing/2016/5/11/chartex" xmlns:cx6="http://schemas.microsoft.com/office/drawing/2016/5/12/chartex" xmlns:cx7="http://schemas.microsoft.com/office/drawing/2016/5/13/chartex" xmlns:cx8="http://schemas.microsoft.com/office/drawing/2016/5/14/chartex" xmlns:cr="http://schemas.microsoft.com/office/comments/2020/reactions" xmlns:mc="http://schemas.openxmlformats.org/markup-compatibility/2006" xmlns:aink="http://schemas.microsoft.com/office/drawing/2016/ink" xmlns:am3d="http://schemas.microsoft.com/office/drawing/2017/model3d" xmlns:o="urn:schemas-microsoft-com:office:office" xmlns:oel="http://schemas.microsoft.com/office/2019/extlst" xmlns:r="http://schemas.openxmlformats.org/officeDocument/2006/relationships" xmlns:m="http://schemas.openxmlformats.org/officeDocument/2006/math" xmlns:v="urn:schemas-microsoft-com:vml" xmlns:wp14="http://schemas.microsoft.com/office/word/2010/wordprocessingDrawing" xmlns:wp="http://schemas.openxmlformats.org/drawingml/2006/wordprocessingDrawing" xmlns:w10="urn:schemas-microsoft-com:office:word" xmlns:w="http://schemas.openxmlformats.org/wordprocessingml/2006/main" xmlns:w14="http://schemas.microsoft.com/office/word/2010/wordml" xmlns:w15="http://schemas.microsoft.com/office/word/2012/wordml" xmlns:w16cex="http://schemas.microsoft.com/office/word/2018/wordml/cex" xmlns:w16cid="http://schemas.microsoft.com/office/word/2016/wordml/cid" xmlns:w16="http://schemas.microsoft.com/office/word/2018/wordml" xmlns:w16du="http://schemas.microsoft.com/office/word/2023/wordml/word16du" xmlns:w16sdtdh="http://schemas.microsoft.com/office/word/2020/wordml/sdtdatahash" xmlns:w16sdtfl="http://schemas.microsoft.com/office/word/2024/wordml/sdtformatlock" xmlns:w16se="http://schemas.microsoft.com/office/word/2015/wordml/symex" xmlns:wpg="http://schemas.microsoft.com/office/word/2010/wordprocessingGroup" xmlns:wpi="http://schemas.microsoft.com/office/word/2010/wordprocessingInk" xmlns:wne="http://schemas.microsoft.com/office/word/2006/wordml" xmlns:wps="http://schemas.microsoft.com/office/word/2010/wordprocessingShape" mc:Ignorable="w14 w15 w16se w16cid w16 w16cex w16sdtdh w16sdtfl cr w16du wp14">
-  <w16cex:commentExtensible w16cex:durableId="4932CF3D" w16cex:dateUtc="2026-06-19T17:33:00Z"/>
-  <w16cex:commentExtensible w16cex:durableId="0C9F8C71" w16cex:dateUtc="2026-06-19T17:34:00Z"/>
   <w16cex:commentExtensible w16cex:durableId="7A265DAA" w16cex:dateUtc="2026-06-19T17:39:00Z"/>
   <w16cex:commentExtensible w16cex:durableId="02D25860" w16cex:dateUtc="2026-06-19T17:42:00Z"/>
+  <w16cex:commentExtensible w16cex:durableId="4EEBE036" w16cex:dateUtc="2026-06-25T10:47:00Z"/>
   <w16cex:commentExtensible w16cex:durableId="7A283E6A" w16cex:dateUtc="2026-06-19T17:45:00Z"/>
+  <w16cex:commentExtensible w16cex:durableId="3D3B4EBF" w16cex:dateUtc="2026-06-25T10:48:00Z"/>
 </w16cex:commentsExtensible>
 </file>
 
 <file path=word/commentsIds.xml><?xml version="1.0" encoding="utf-8"?>
 <w16cid:commentsIds xmlns:wpc="http://schemas.microsoft.com/office/word/2010/wordprocessingCanvas" xmlns:cx="http://schemas.microsoft.com/office/drawing/2014/chartex" xmlns:cx1="http://schemas.microsoft.com/office/drawing/2015/9/8/chartex" xmlns:cx2="http://schemas.microsoft.com/office/drawing/2015/10/21/chartex" xmlns:cx3="http://schemas.microsoft.com/office/drawing/2016/5/9/chartex" xmlns:cx4="http://schemas.microsoft.com/office/drawing/2016/5/10/chartex" xmlns:cx5="http://schemas.microsoft.com/office/drawing/2016/5/11/chartex" xmlns:cx6="http://schemas.microsoft.com/office/drawing/2016/5/12/chartex" xmlns:cx7="http://schemas.microsoft.com/office/drawing/2016/5/13/chartex" xmlns:cx8="http://schemas.microsoft.com/office/drawing/2016/5/14/chartex" xmlns:mc="http://schemas.openxmlformats.org/markup-compatibility/2006" xmlns:aink="http://schemas.microsoft.com/office/drawing/2016/ink" xmlns:am3d="http://schemas.microsoft.com/office/drawing/2017/model3d" xmlns:o="urn:schemas-microsoft-com:office:office" xmlns:oel="http://schemas.microsoft.com/office/2019/extlst" xmlns:r="http://schemas.openxmlformats.org/officeDocument/2006/relationships" xmlns:m="http://schemas.openxmlformats.org/officeDocument/2006/math" xmlns:v="urn:schemas-microsoft-com:vml" xmlns:wp14="http://schemas.microsoft.com/office/word/2010/wordprocessingDrawing" xmlns:wp="http://schemas.openxmlformats.org/drawingml/2006/wordprocessingDrawing" xmlns:w10="urn:schemas-microsoft-com:office:word" xmlns:w="http://schemas.openxmlformats.org/wordprocessingml/2006/main" xmlns:w14="http://schemas.microsoft.com/office/word/2010/wordml" xmlns:w15="http://schemas.microsoft.com/office/word/2012/wordml" xmlns:w16cex="http://schemas.microsoft.com/office/word/2018/wordml/cex" xmlns:w16cid="http://schemas.microsoft.com/office/word/2016/wordml/cid" xmlns:w16="http://schemas.microsoft.com/office/word/2018/wordml" xmlns:w16du="http://schemas.microsoft.com/office/word/2023/wordml/word16du" xmlns:w16sdtdh="http://schemas.microsoft.com/office/word/2020/wordml/sdtdatahash" xmlns:w16sdtfl="http://schemas.microsoft.com/office/word/2024/wordml/sdtformatlock" xmlns:w16se="http://schemas.microsoft.com/office/word/2015/wordml/symex" xmlns:wpg="http://schemas.microsoft.com/office/word/2010/wordprocessingGroup" xmlns:wpi="http://schemas.microsoft.com/office/word/2010/wordprocessingInk" xmlns:wne="http://schemas.microsoft.com/office/word/2006/wordml" xmlns:wps="http://schemas.microsoft.com/office/word/2010/wordprocessingShape" mc:Ignorable="w14 w15 w16se w16cid w16 w16cex w16sdtdh w16sdtfl w16du wp14">
-  <w16cid:commentId w16cid:paraId="1531EC56" w16cid:durableId="4932CF3D"/>
-  <w16cid:commentId w16cid:paraId="0FC473E1" w16cid:durableId="0C9F8C71"/>
   <w16cid:commentId w16cid:paraId="03418435" w16cid:durableId="7A265DAA"/>
   <w16cid:commentId w16cid:paraId="4ACB135A" w16cid:durableId="02D25860"/>
+  <w16cid:commentId w16cid:paraId="1DC52F10" w16cid:durableId="4EEBE036"/>
   <w16cid:commentId w16cid:paraId="57AAFF26" w16cid:durableId="7A283E6A"/>
+  <w16cid:commentId w16cid:paraId="72B35436" w16cid:durableId="3D3B4EBF"/>
 </w16cid:commentsIds>
 </file>
 
@@ -6225,6 +6296,9 @@
 <w15:people xmlns:wpc="http://schemas.microsoft.com/office/word/2010/wordprocessingCanvas" xmlns:cx="http://schemas.microsoft.com/office/drawing/2014/chartex" xmlns:cx1="http://schemas.microsoft.com/office/drawing/2015/9/8/chartex" xmlns:cx2="http://schemas.microsoft.com/office/drawing/2015/10/21/chartex" xmlns:cx3="http://schemas.microsoft.com/office/drawing/2016/5/9/chartex" xmlns:cx4="http://schemas.microsoft.com/office/drawing/2016/5/10/chartex" xmlns:cx5="http://schemas.microsoft.com/office/drawing/2016/5/11/chartex" xmlns:cx6="http://schemas.microsoft.com/office/drawing/2016/5/12/chartex" xmlns:cx7="http://schemas.microsoft.com/office/drawing/2016/5/13/chartex" xmlns:cx8="http://schemas.microsoft.com/office/drawing/2016/5/14/chartex" xmlns:mc="http://schemas.openxmlformats.org/markup-compatibility/2006" xmlns:aink="http://schemas.microsoft.com/office/drawing/2016/ink" xmlns:am3d="http://schemas.microsoft.com/office/drawing/2017/model3d" xmlns:o="urn:schemas-microsoft-com:office:office" xmlns:oel="http://schemas.microsoft.com/office/2019/extlst" xmlns:r="http://schemas.openxmlformats.org/officeDocument/2006/relationships" xmlns:m="http://schemas.openxmlformats.org/officeDocument/2006/math" xmlns:v="urn:schemas-microsoft-com:vml" xmlns:wp14="http://schemas.microsoft.com/office/word/2010/wordprocessingDrawing" xmlns:wp="http://schemas.openxmlformats.org/drawingml/2006/wordprocessingDrawing" xmlns:w10="urn:schemas-microsoft-com:office:word" xmlns:w="http://schemas.openxmlformats.org/wordprocessingml/2006/main" xmlns:w14="http://schemas.microsoft.com/office/word/2010/wordml" xmlns:w15="http://schemas.microsoft.com/office/word/2012/wordml" xmlns:w16cex="http://schemas.microsoft.com/office/word/2018/wordml/cex" xmlns:w16cid="http://schemas.microsoft.com/office/word/2016/wordml/cid" xmlns:w16="http://schemas.microsoft.com/office/word/2018/wordml" xmlns:w16du="http://schemas.microsoft.com/office/word/2023/wordml/word16du" xmlns:w16sdtdh="http://schemas.microsoft.com/office/word/2020/wordml/sdtdatahash" xmlns:w16sdtfl="http://schemas.microsoft.com/office/word/2024/wordml/sdtformatlock" xmlns:w16se="http://schemas.microsoft.com/office/word/2015/wordml/symex" xmlns:wpg="http://schemas.microsoft.com/office/word/2010/wordprocessingGroup" xmlns:wpi="http://schemas.microsoft.com/office/word/2010/wordprocessingInk" xmlns:wne="http://schemas.microsoft.com/office/word/2006/wordml" xmlns:wps="http://schemas.microsoft.com/office/word/2010/wordprocessingShape" mc:Ignorable="w14 w15 w16se w16cid w16 w16cex w16sdtdh w16sdtfl w16du wp14">
   <w15:person w15:author="Robert Esposito">
     <w15:presenceInfo w15:providerId="AD" w15:userId="S::rme70@spanport.rutgers.edu::619e3713-704e-4767-bc53-c5189c341c39"/>
+  </w15:person>
+  <w15:person w15:author="Kendra Dickinson">
+    <w15:presenceInfo w15:providerId="AD" w15:userId="S::kd866@spanport.rutgers.edu::453a5979-f629-47c6-b178-c7feeb10dddc"/>
   </w15:person>
 </w15:people>
 </file>

</xml_diff>

<commit_message>
added comments/rqs to preregistration doc
</commit_message>
<xml_diff>
--- a/irb/IRB questions draft/pt_in_nj_irb_notes.docx
+++ b/irb/IRB questions draft/pt_in_nj_irb_notes.docx
@@ -4942,6 +4942,7 @@
           <w:shd w:val="clear" w:color="auto" w:fill="FFFFFF"/>
         </w:rPr>
       </w:pPr>
+      <w:commentRangeStart w:id="5"/>
       <w:r>
         <w:rPr>
           <w:rFonts w:ascii="Palatino Linotype" w:hAnsi="Palatino Linotype" w:cs="Arial"/>
@@ -4953,6 +4954,20 @@
           <w:shd w:val="clear" w:color="auto" w:fill="FFFFFF"/>
         </w:rPr>
         <w:t>Approx. length of participation (45 min?)</w:t>
+      </w:r>
+      <w:commentRangeEnd w:id="5"/>
+      <w:r>
+        <w:rPr>
+          <w:rStyle w:val="CommentReference"/>
+          <w:rFonts w:ascii="Palatino Linotype" w:hAnsi="Palatino Linotype" w:cs="Arial"/>
+          <w:b/>
+          <w:bCs/>
+          <w:color w:val="000000" w:themeColor="text1"/>
+          <w:sz w:val="20"/>
+          <w:szCs w:val="20"/>
+          <w:shd w:val="clear" w:color="auto" w:fill="FFFFFF"/>
+        </w:rPr>
+        <w:commentReference w:id="5"/>
       </w:r>
     </w:p>
     <w:p>
@@ -5433,6 +5448,23 @@
       </w:r>
     </w:p>
   </w:comment>
+  <w:comment w:id="5" w:author="Kendra Dickinson" w:date="2026-06-25T07:09:00Z" w:initials="KD">
+    <w:p>
+      <w:r>
+        <w:rPr>
+          <w:rStyle w:val="CommentReference"/>
+        </w:rPr>
+        <w:annotationRef/>
+      </w:r>
+      <w:r>
+        <w:rPr>
+          <w:sz w:val="20"/>
+          <w:szCs w:val="20"/>
+        </w:rPr>
+        <w:t>What do you think, Robert?</w:t>
+      </w:r>
+    </w:p>
+  </w:comment>
 </w:comments>
 </file>
 
@@ -5443,6 +5475,7 @@
   <w15:commentEx w15:paraId="1DC52F10" w15:paraIdParent="4ACB135A" w15:done="0"/>
   <w15:commentEx w15:paraId="57AAFF26" w15:done="0"/>
   <w15:commentEx w15:paraId="72B35436" w15:paraIdParent="57AAFF26" w15:done="0"/>
+  <w15:commentEx w15:paraId="618C0F5F" w15:done="0"/>
 </w15:commentsEx>
 </file>
 
@@ -5453,6 +5486,7 @@
   <w16cex:commentExtensible w16cex:durableId="4EEBE036" w16cex:dateUtc="2026-06-25T10:47:00Z"/>
   <w16cex:commentExtensible w16cex:durableId="7A283E6A" w16cex:dateUtc="2026-06-19T17:45:00Z"/>
   <w16cex:commentExtensible w16cex:durableId="3D3B4EBF" w16cex:dateUtc="2026-06-25T10:48:00Z"/>
+  <w16cex:commentExtensible w16cex:durableId="2C479B7D" w16cex:dateUtc="2026-06-25T11:09:00Z"/>
 </w16cex:commentsExtensible>
 </file>
 
@@ -5463,6 +5497,7 @@
   <w16cid:commentId w16cid:paraId="1DC52F10" w16cid:durableId="4EEBE036"/>
   <w16cid:commentId w16cid:paraId="57AAFF26" w16cid:durableId="7A283E6A"/>
   <w16cid:commentId w16cid:paraId="72B35436" w16cid:durableId="3D3B4EBF"/>
+  <w16cid:commentId w16cid:paraId="618C0F5F" w16cid:durableId="2C479B7D"/>
 </w16cid:commentsIds>
 </file>
 

</xml_diff>

<commit_message>
updated docs for irb
</commit_message>
<xml_diff>
--- a/irb/IRB questions draft/pt_in_nj_irb_notes.docx
+++ b/irb/IRB questions draft/pt_in_nj_irb_notes.docx
@@ -987,7 +987,27 @@
           <w:szCs w:val="20"/>
           <w:shd w:val="clear" w:color="auto" w:fill="FFFFFF"/>
         </w:rPr>
-        <w:t>We anticipate data collection for the present study to take place between September 2026 and September 2027. The duration for each participant’s active participation in the study is approximately 30-60 minutes. However, participants will be informed during consent discussions that their voice recordings will be used for future research in perpetuity.</w:t>
+        <w:t xml:space="preserve">We anticipate data collection for the present study to take place between September 2026 and September 2027. The duration for each participant’s active participation in the study is approximately </w:t>
+      </w:r>
+      <w:r>
+        <w:rPr>
+          <w:rFonts w:ascii="Palatino Linotype" w:hAnsi="Palatino Linotype" w:cs="Arial"/>
+          <w:color w:val="000000" w:themeColor="text1"/>
+          <w:sz w:val="20"/>
+          <w:szCs w:val="20"/>
+          <w:shd w:val="clear" w:color="auto" w:fill="FFFFFF"/>
+        </w:rPr>
+        <w:t>45</w:t>
+      </w:r>
+      <w:r>
+        <w:rPr>
+          <w:rFonts w:ascii="Palatino Linotype" w:hAnsi="Palatino Linotype" w:cs="Arial"/>
+          <w:color w:val="000000" w:themeColor="text1"/>
+          <w:sz w:val="20"/>
+          <w:szCs w:val="20"/>
+          <w:shd w:val="clear" w:color="auto" w:fill="FFFFFF"/>
+        </w:rPr>
+        <w:t>-60 minutes. However, participants will be informed during consent discussions that their voice recordings will be used for future research in perpetuity.</w:t>
       </w:r>
     </w:p>
     <w:p>
@@ -5471,10 +5491,10 @@
 <file path=word/commentsExtended.xml><?xml version="1.0" encoding="utf-8"?>
 <w15:commentsEx xmlns:wpc="http://schemas.microsoft.com/office/word/2010/wordprocessingCanvas" xmlns:cx="http://schemas.microsoft.com/office/drawing/2014/chartex" xmlns:cx1="http://schemas.microsoft.com/office/drawing/2015/9/8/chartex" xmlns:cx2="http://schemas.microsoft.com/office/drawing/2015/10/21/chartex" xmlns:cx3="http://schemas.microsoft.com/office/drawing/2016/5/9/chartex" xmlns:cx4="http://schemas.microsoft.com/office/drawing/2016/5/10/chartex" xmlns:cx5="http://schemas.microsoft.com/office/drawing/2016/5/11/chartex" xmlns:cx6="http://schemas.microsoft.com/office/drawing/2016/5/12/chartex" xmlns:cx7="http://schemas.microsoft.com/office/drawing/2016/5/13/chartex" xmlns:cx8="http://schemas.microsoft.com/office/drawing/2016/5/14/chartex" xmlns:mc="http://schemas.openxmlformats.org/markup-compatibility/2006" xmlns:aink="http://schemas.microsoft.com/office/drawing/2016/ink" xmlns:am3d="http://schemas.microsoft.com/office/drawing/2017/model3d" xmlns:o="urn:schemas-microsoft-com:office:office" xmlns:oel="http://schemas.microsoft.com/office/2019/extlst" xmlns:r="http://schemas.openxmlformats.org/officeDocument/2006/relationships" xmlns:m="http://schemas.openxmlformats.org/officeDocument/2006/math" xmlns:v="urn:schemas-microsoft-com:vml" xmlns:wp14="http://schemas.microsoft.com/office/word/2010/wordprocessingDrawing" xmlns:wp="http://schemas.openxmlformats.org/drawingml/2006/wordprocessingDrawing" xmlns:w10="urn:schemas-microsoft-com:office:word" xmlns:w="http://schemas.openxmlformats.org/wordprocessingml/2006/main" xmlns:w14="http://schemas.microsoft.com/office/word/2010/wordml" xmlns:w15="http://schemas.microsoft.com/office/word/2012/wordml" xmlns:w16cex="http://schemas.microsoft.com/office/word/2018/wordml/cex" xmlns:w16cid="http://schemas.microsoft.com/office/word/2016/wordml/cid" xmlns:w16="http://schemas.microsoft.com/office/word/2018/wordml" xmlns:w16du="http://schemas.microsoft.com/office/word/2023/wordml/word16du" xmlns:w16sdtdh="http://schemas.microsoft.com/office/word/2020/wordml/sdtdatahash" xmlns:w16sdtfl="http://schemas.microsoft.com/office/word/2024/wordml/sdtformatlock" xmlns:w16se="http://schemas.microsoft.com/office/word/2015/wordml/symex" xmlns:wpg="http://schemas.microsoft.com/office/word/2010/wordprocessingGroup" xmlns:wpi="http://schemas.microsoft.com/office/word/2010/wordprocessingInk" xmlns:wne="http://schemas.microsoft.com/office/word/2006/wordml" xmlns:wps="http://schemas.microsoft.com/office/word/2010/wordprocessingShape" mc:Ignorable="w14 w15 w16se w16cid w16 w16cex w16sdtdh w16sdtfl w16du wp14">
   <w15:commentEx w15:paraId="03418435" w15:done="1"/>
-  <w15:commentEx w15:paraId="4ACB135A" w15:done="0"/>
-  <w15:commentEx w15:paraId="1DC52F10" w15:paraIdParent="4ACB135A" w15:done="0"/>
-  <w15:commentEx w15:paraId="57AAFF26" w15:done="0"/>
-  <w15:commentEx w15:paraId="72B35436" w15:paraIdParent="57AAFF26" w15:done="0"/>
+  <w15:commentEx w15:paraId="4ACB135A" w15:done="1"/>
+  <w15:commentEx w15:paraId="1DC52F10" w15:paraIdParent="4ACB135A" w15:done="1"/>
+  <w15:commentEx w15:paraId="57AAFF26" w15:done="1"/>
+  <w15:commentEx w15:paraId="72B35436" w15:paraIdParent="57AAFF26" w15:done="1"/>
   <w15:commentEx w15:paraId="618C0F5F" w15:done="0"/>
 </w15:commentsEx>
 </file>

</xml_diff>